<commit_message>
fixing chapter 1 2 3 and more
</commit_message>
<xml_diff>
--- a/02 ใบรับรองปริญญานิพนธ์ ใหม่.docx
+++ b/02 ใบรับรองปริญญานิพนธ์ ใหม่.docx
@@ -216,7 +216,7 @@
         </w:tabs>
         <w:ind w:left="540" w:hanging="398"/>
         <w:rPr>
-          <w:rFonts w:ascii="TH SarabunPSK" w:hAnsi="TH SarabunPSK" w:cs="TH SarabunPSK" w:hint="cs"/>
+          <w:rFonts w:ascii="TH SarabunPSK" w:hAnsi="TH SarabunPSK" w:cs="TH SarabunPSK"/>
           <w:cs/>
         </w:rPr>
       </w:pPr>
@@ -406,9 +406,6 @@
         <w:rPr>
           <w:rFonts w:ascii="TH SarabunPSK" w:hAnsi="TH SarabunPSK" w:cs="TH SarabunPSK"/>
           <w:snapToGrid w:val="0"/>
-          <w:sz w:val="40"/>
-          <w:szCs w:val="40"/>
-          <w:cs/>
           <w:lang w:eastAsia="th-TH"/>
         </w:rPr>
       </w:pPr>
@@ -469,8 +466,7 @@
         <w:rPr>
           <w:rFonts w:ascii="TH SarabunPSK" w:hAnsi="TH SarabunPSK" w:cs="TH SarabunPSK"/>
           <w:snapToGrid w:val="0"/>
-          <w:sz w:val="24"/>
-          <w:szCs w:val="24"/>
+          <w:cs/>
           <w:lang w:eastAsia="th-TH"/>
         </w:rPr>
       </w:pPr>
@@ -480,12 +476,33 @@
         <w:tabs>
           <w:tab w:val="left" w:pos="540"/>
         </w:tabs>
-        <w:ind w:left="540" w:hanging="540"/>
-        <w:rPr>
-          <w:rFonts w:ascii="TH SarabunPSK" w:hAnsi="TH SarabunPSK" w:cs="TH SarabunPSK"/>
-          <w:snapToGrid w:val="0"/>
-          <w:sz w:val="24"/>
-          <w:szCs w:val="24"/>
+        <w:rPr>
+          <w:rFonts w:ascii="TH SarabunPSK" w:hAnsi="TH SarabunPSK" w:cs="TH SarabunPSK"/>
+          <w:snapToGrid w:val="0"/>
+          <w:lang w:eastAsia="th-TH"/>
+        </w:rPr>
+      </w:pPr>
+    </w:p>
+    <w:p>
+      <w:pPr>
+        <w:tabs>
+          <w:tab w:val="left" w:pos="540"/>
+        </w:tabs>
+        <w:rPr>
+          <w:rFonts w:ascii="TH SarabunPSK" w:hAnsi="TH SarabunPSK" w:cs="TH SarabunPSK"/>
+          <w:snapToGrid w:val="0"/>
+          <w:lang w:eastAsia="th-TH"/>
+        </w:rPr>
+      </w:pPr>
+    </w:p>
+    <w:p>
+      <w:pPr>
+        <w:tabs>
+          <w:tab w:val="left" w:pos="540"/>
+        </w:tabs>
+        <w:rPr>
+          <w:rFonts w:ascii="TH SarabunPSK" w:hAnsi="TH SarabunPSK" w:cs="TH SarabunPSK"/>
+          <w:snapToGrid w:val="0"/>
           <w:cs/>
           <w:lang w:eastAsia="th-TH"/>
         </w:rPr>
@@ -1063,6 +1080,7 @@
     <w:lsdException w:name="Strong" w:qFormat="1"/>
     <w:lsdException w:name="Emphasis" w:qFormat="1"/>
     <w:lsdException w:name="HTML Variable" w:semiHidden="1" w:unhideWhenUsed="1"/>
+    <w:lsdException w:name="Normal Table" w:semiHidden="1" w:unhideWhenUsed="1"/>
     <w:lsdException w:name="Outline List 3" w:semiHidden="1" w:unhideWhenUsed="1"/>
     <w:lsdException w:name="Table Simple 1" w:semiHidden="1" w:unhideWhenUsed="1"/>
     <w:lsdException w:name="Table Simple 2" w:semiHidden="1" w:unhideWhenUsed="1"/>
@@ -1105,7 +1123,9 @@
     <w:lsdException w:name="Table Subtle 2" w:semiHidden="1" w:unhideWhenUsed="1"/>
     <w:lsdException w:name="Table Web 1" w:semiHidden="1" w:unhideWhenUsed="1"/>
     <w:lsdException w:name="Table Web 2" w:semiHidden="1" w:unhideWhenUsed="1"/>
+    <w:lsdException w:name="Table Web 3" w:semiHidden="1" w:unhideWhenUsed="1"/>
     <w:lsdException w:name="Balloon Text" w:semiHidden="1" w:unhideWhenUsed="1"/>
+    <w:lsdException w:name="Table Theme" w:semiHidden="1" w:unhideWhenUsed="1"/>
     <w:lsdException w:name="Placeholder Text" w:semiHidden="1" w:uiPriority="99"/>
     <w:lsdException w:name="No Spacing" w:uiPriority="1" w:qFormat="1"/>
     <w:lsdException w:name="Light Shading" w:uiPriority="60"/>

</xml_diff>